<commit_message>
Updates for 2.14.2 release
</commit_message>
<xml_diff>
--- a/documentation/RGA_RELEASE_NOTES.docx
+++ b/documentation/RGA_RELEASE_NOTES.docx
@@ -30,6 +30,13 @@
           <w:szCs w:val="52"/>
         </w:rPr>
         <w:t>4</w:t>
+      </w:r>
+      <w:r>
+        <w:rPr>
+          <w:sz w:val="52"/>
+          <w:szCs w:val="52"/>
+        </w:rPr>
+        <w:t>.2</w:t>
       </w:r>
       <w:r>
         <w:rPr>
@@ -66,7 +73,37 @@
           <w:sz w:val="20"/>
           <w:szCs w:val="20"/>
         </w:rPr>
-        <w:t>Analyze precompiled HIP GPU Code Object binaries for the MI-350 (gfx950 CDNA™ 4 architecture) with RGA's Binary Analysis mode.</w:t>
+        <w:t>Updated the disassembler, addressing a few stability issues.</w:t>
+      </w:r>
+    </w:p>
+    <w:p>
+      <w:pPr>
+        <w:shd w:val="clear" w:color="auto" w:fill="FFFFFF"/>
+        <w:spacing w:before="100" w:beforeAutospacing="1" w:after="100" w:afterAutospacing="1" w:line="240" w:lineRule="auto"/>
+        <w:rPr>
+          <w:b/>
+          <w:bCs/>
+          <w:sz w:val="20"/>
+          <w:szCs w:val="20"/>
+        </w:rPr>
+      </w:pPr>
+      <w:r>
+        <w:rPr>
+          <w:b/>
+          <w:bCs/>
+          <w:sz w:val="20"/>
+          <w:szCs w:val="20"/>
+        </w:rPr>
+        <w:t>Notes:</w:t>
+      </w:r>
+      <w:r>
+        <w:rPr>
+          <w:b/>
+          <w:bCs/>
+          <w:sz w:val="20"/>
+          <w:szCs w:val="20"/>
+        </w:rPr>
+        <w:t xml:space="preserve"> </w:t>
       </w:r>
     </w:p>
     <w:p>
@@ -88,21 +125,53 @@
           <w:sz w:val="20"/>
           <w:szCs w:val="20"/>
         </w:rPr>
-        <w:t>Compile and analyze OpenCL</w:t>
-      </w:r>
-      <w:r>
-        <w:rPr>
-          <w:sz w:val="20"/>
-          <w:szCs w:val="20"/>
-        </w:rPr>
-        <w:t>™</w:t>
-      </w:r>
-      <w:r>
-        <w:rPr>
-          <w:sz w:val="20"/>
-          <w:szCs w:val="20"/>
-        </w:rPr>
-        <w:t xml:space="preserve"> kernels for MI-350 (gfx950 CDNA™ 4 architecture).</w:t>
+        <w:t xml:space="preserve">With the introduction of 25.20-based Linux drivers, the AMDVLK driver is no longer included in the </w:t>
+      </w:r>
+      <w:proofErr w:type="spellStart"/>
+      <w:r>
+        <w:rPr>
+          <w:sz w:val="20"/>
+          <w:szCs w:val="20"/>
+        </w:rPr>
+        <w:t>amdgpu</w:t>
+      </w:r>
+      <w:proofErr w:type="spellEnd"/>
+      <w:r>
+        <w:rPr>
+          <w:sz w:val="20"/>
+          <w:szCs w:val="20"/>
+        </w:rPr>
+        <w:t xml:space="preserve">-pro driver package. This is a result of the AMDVLK open-source project being discontinued as mentioned here (https://github.com/GPUOpen-Drivers/AMDVLK/discussions/416). Instead, the RADV open-source Vulkan® driver is installed by default. Consequently, live driver compilation of Vulkan pipelines using RGA is no longer supported with the latest drivers. For a limited transition period, RGA will still bundle the latest amdvlk64.so from the latest 25.10 </w:t>
+      </w:r>
+      <w:proofErr w:type="spellStart"/>
+      <w:r>
+        <w:rPr>
+          <w:sz w:val="20"/>
+          <w:szCs w:val="20"/>
+        </w:rPr>
+        <w:t>amdgpu</w:t>
+      </w:r>
+      <w:proofErr w:type="spellEnd"/>
+      <w:r>
+        <w:rPr>
+          <w:sz w:val="20"/>
+          <w:szCs w:val="20"/>
+        </w:rPr>
+        <w:t xml:space="preserve">-pro driver release which </w:t>
+      </w:r>
+      <w:r>
+        <w:rPr>
+          <w:sz w:val="20"/>
+          <w:szCs w:val="20"/>
+        </w:rPr>
+        <w:t>can be</w:t>
+      </w:r>
+      <w:r>
+        <w:rPr>
+          <w:sz w:val="20"/>
+          <w:szCs w:val="20"/>
+        </w:rPr>
+        <w:t xml:space="preserve"> used for reference. RGA will also continue to support Vulkan pipeline compilation on Linux through its offline Vulkan mode.</w:t>
       </w:r>
     </w:p>
     <w:p>
@@ -124,37 +193,7 @@
           <w:sz w:val="20"/>
           <w:szCs w:val="20"/>
         </w:rPr>
-        <w:t>Added support for the gfx1153 as a compilation target across all RGA's modes.</w:t>
-      </w:r>
-    </w:p>
-    <w:p>
-      <w:pPr>
-        <w:shd w:val="clear" w:color="auto" w:fill="FFFFFF"/>
-        <w:spacing w:before="100" w:beforeAutospacing="1" w:after="100" w:afterAutospacing="1" w:line="240" w:lineRule="auto"/>
-        <w:rPr>
-          <w:b/>
-          <w:bCs/>
-          <w:sz w:val="20"/>
-          <w:szCs w:val="20"/>
-        </w:rPr>
-      </w:pPr>
-      <w:r>
-        <w:rPr>
-          <w:b/>
-          <w:bCs/>
-          <w:sz w:val="20"/>
-          <w:szCs w:val="20"/>
-        </w:rPr>
-        <w:t>Notes:</w:t>
-      </w:r>
-      <w:r>
-        <w:rPr>
-          <w:b/>
-          <w:bCs/>
-          <w:sz w:val="20"/>
-          <w:szCs w:val="20"/>
-        </w:rPr>
-        <w:t xml:space="preserve"> </w:t>
+        <w:t>With the upgraded ISA disassembly view clock cycle estimates are no longer presented.</w:t>
       </w:r>
     </w:p>
     <w:p>
@@ -176,53 +215,7 @@
           <w:sz w:val="20"/>
           <w:szCs w:val="20"/>
         </w:rPr>
-        <w:t xml:space="preserve">With the introduction of 25.20-based Linux drivers, the AMDVLK driver is no longer included in the </w:t>
-      </w:r>
-      <w:proofErr w:type="spellStart"/>
-      <w:r>
-        <w:rPr>
-          <w:sz w:val="20"/>
-          <w:szCs w:val="20"/>
-        </w:rPr>
-        <w:t>amdgpu</w:t>
-      </w:r>
-      <w:proofErr w:type="spellEnd"/>
-      <w:r>
-        <w:rPr>
-          <w:sz w:val="20"/>
-          <w:szCs w:val="20"/>
-        </w:rPr>
-        <w:t xml:space="preserve">-pro driver package. This is a result of the AMDVLK open-source project being discontinued as mentioned here (https://github.com/GPUOpen-Drivers/AMDVLK/discussions/416). Instead, the RADV open-source Vulkan® driver is installed by default. Consequently, live driver compilation of Vulkan pipelines using RGA is no longer supported with the latest drivers. For a limited transition period, RGA will still bundle the latest amdvlk64.so from the latest 25.10 </w:t>
-      </w:r>
-      <w:proofErr w:type="spellStart"/>
-      <w:r>
-        <w:rPr>
-          <w:sz w:val="20"/>
-          <w:szCs w:val="20"/>
-        </w:rPr>
-        <w:t>amdgpu</w:t>
-      </w:r>
-      <w:proofErr w:type="spellEnd"/>
-      <w:r>
-        <w:rPr>
-          <w:sz w:val="20"/>
-          <w:szCs w:val="20"/>
-        </w:rPr>
-        <w:t xml:space="preserve">-pro driver release which </w:t>
-      </w:r>
-      <w:r>
-        <w:rPr>
-          <w:sz w:val="20"/>
-          <w:szCs w:val="20"/>
-        </w:rPr>
-        <w:t>can be</w:t>
-      </w:r>
-      <w:r>
-        <w:rPr>
-          <w:sz w:val="20"/>
-          <w:szCs w:val="20"/>
-        </w:rPr>
-        <w:t xml:space="preserve"> used for reference. RGA will also continue to support Vulkan pipeline compilation on Linux through its offline Vulkan mode.</w:t>
+        <w:t>Clock cycle estimates are no longer presented by the upgraded ISA disassembly view in RGA GUI application.</w:t>
       </w:r>
     </w:p>
     <w:p>
@@ -244,7 +237,7 @@
           <w:sz w:val="20"/>
           <w:szCs w:val="20"/>
         </w:rPr>
-        <w:t>With the upgraded ISA disassembly view clock cycle estimates are no longer presented.</w:t>
+        <w:t>The new disassembly view presents Functional Groups, leveraging the AMD GPU machine-readable ISA documentation.</w:t>
       </w:r>
     </w:p>
     <w:p>
@@ -266,7 +259,23 @@
           <w:sz w:val="20"/>
           <w:szCs w:val="20"/>
         </w:rPr>
-        <w:t>Clock cycle estimates are no longer presented by the upgraded ISA disassembly view in RGA GUI application.</w:t>
+        <w:t xml:space="preserve">For backward compatibility, the RGA CLI output presents Cycle estimates and Functional Unit fields </w:t>
+      </w:r>
+      <w:proofErr w:type="gramStart"/>
+      <w:r>
+        <w:rPr>
+          <w:sz w:val="20"/>
+          <w:szCs w:val="20"/>
+        </w:rPr>
+        <w:t>similar to</w:t>
+      </w:r>
+      <w:proofErr w:type="gramEnd"/>
+      <w:r>
+        <w:rPr>
+          <w:sz w:val="20"/>
+          <w:szCs w:val="20"/>
+        </w:rPr>
+        <w:t xml:space="preserve"> RGA 2.11.</w:t>
       </w:r>
     </w:p>
     <w:p>
@@ -288,66 +297,6 @@
           <w:sz w:val="20"/>
           <w:szCs w:val="20"/>
         </w:rPr>
-        <w:t>The new disassembly view presents Functional Groups, leveraging the AMD GPU machine-readable ISA documentation.</w:t>
-      </w:r>
-    </w:p>
-    <w:p>
-      <w:pPr>
-        <w:pStyle w:val="ListParagraph"/>
-        <w:numPr>
-          <w:ilvl w:val="0"/>
-          <w:numId w:val="14"/>
-        </w:numPr>
-        <w:shd w:val="clear" w:color="auto" w:fill="FFFFFF"/>
-        <w:spacing w:before="100" w:beforeAutospacing="1" w:after="100" w:afterAutospacing="1" w:line="240" w:lineRule="auto"/>
-        <w:rPr>
-          <w:sz w:val="20"/>
-          <w:szCs w:val="20"/>
-        </w:rPr>
-      </w:pPr>
-      <w:r>
-        <w:rPr>
-          <w:sz w:val="20"/>
-          <w:szCs w:val="20"/>
-        </w:rPr>
-        <w:t xml:space="preserve">For backward compatibility, the RGA CLI output presents Cycle estimates and Functional Unit fields </w:t>
-      </w:r>
-      <w:proofErr w:type="gramStart"/>
-      <w:r>
-        <w:rPr>
-          <w:sz w:val="20"/>
-          <w:szCs w:val="20"/>
-        </w:rPr>
-        <w:t>similar to</w:t>
-      </w:r>
-      <w:proofErr w:type="gramEnd"/>
-      <w:r>
-        <w:rPr>
-          <w:sz w:val="20"/>
-          <w:szCs w:val="20"/>
-        </w:rPr>
-        <w:t xml:space="preserve"> RGA 2.11.</w:t>
-      </w:r>
-    </w:p>
-    <w:p>
-      <w:pPr>
-        <w:pStyle w:val="ListParagraph"/>
-        <w:numPr>
-          <w:ilvl w:val="0"/>
-          <w:numId w:val="14"/>
-        </w:numPr>
-        <w:shd w:val="clear" w:color="auto" w:fill="FFFFFF"/>
-        <w:spacing w:before="100" w:beforeAutospacing="1" w:after="100" w:afterAutospacing="1" w:line="240" w:lineRule="auto"/>
-        <w:rPr>
-          <w:sz w:val="20"/>
-          <w:szCs w:val="20"/>
-        </w:rPr>
-      </w:pPr>
-      <w:r>
-        <w:rPr>
-          <w:sz w:val="20"/>
-          <w:szCs w:val="20"/>
-        </w:rPr>
         <w:t xml:space="preserve">We are working on a revised performance estimate mechanism and will share more details </w:t>
       </w:r>
       <w:proofErr w:type="gramStart"/>
@@ -655,7 +604,6 @@
         <w:pStyle w:val="Heading2"/>
       </w:pPr>
       <w:r>
-        <w:lastRenderedPageBreak/>
         <w:t>DirectX</w:t>
       </w:r>
       <w:r>
@@ -731,6 +679,7 @@
         <w:pStyle w:val="Heading2"/>
       </w:pPr>
       <w:r>
+        <w:lastRenderedPageBreak/>
         <w:t>Vulkan Offline Modes (</w:t>
       </w:r>
       <w:proofErr w:type="spellStart"/>
@@ -1574,40 +1523,40 @@
           <w:sz w:val="20"/>
           <w:szCs w:val="20"/>
         </w:rPr>
+        <w:t>CapabilitySampled1D</w:t>
+      </w:r>
+    </w:p>
+    <w:p>
+      <w:pPr>
+        <w:pStyle w:val="ListParagraph"/>
+        <w:rPr>
+          <w:sz w:val="20"/>
+          <w:szCs w:val="20"/>
+        </w:rPr>
+      </w:pPr>
+      <w:r>
+        <w:rPr>
+          <w:sz w:val="20"/>
+          <w:szCs w:val="20"/>
+        </w:rPr>
+        <w:t>CapabilityImage1D</w:t>
+      </w:r>
+    </w:p>
+    <w:p>
+      <w:pPr>
+        <w:pStyle w:val="ListParagraph"/>
+        <w:rPr>
+          <w:sz w:val="20"/>
+          <w:szCs w:val="20"/>
+        </w:rPr>
+      </w:pPr>
+      <w:proofErr w:type="spellStart"/>
+      <w:r>
+        <w:rPr>
+          <w:sz w:val="20"/>
+          <w:szCs w:val="20"/>
+        </w:rPr>
         <w:lastRenderedPageBreak/>
-        <w:t>CapabilitySampled1D</w:t>
-      </w:r>
-    </w:p>
-    <w:p>
-      <w:pPr>
-        <w:pStyle w:val="ListParagraph"/>
-        <w:rPr>
-          <w:sz w:val="20"/>
-          <w:szCs w:val="20"/>
-        </w:rPr>
-      </w:pPr>
-      <w:r>
-        <w:rPr>
-          <w:sz w:val="20"/>
-          <w:szCs w:val="20"/>
-        </w:rPr>
-        <w:t>CapabilityImage1D</w:t>
-      </w:r>
-    </w:p>
-    <w:p>
-      <w:pPr>
-        <w:pStyle w:val="ListParagraph"/>
-        <w:rPr>
-          <w:sz w:val="20"/>
-          <w:szCs w:val="20"/>
-        </w:rPr>
-      </w:pPr>
-      <w:proofErr w:type="spellStart"/>
-      <w:r>
-        <w:rPr>
-          <w:sz w:val="20"/>
-          <w:szCs w:val="20"/>
-        </w:rPr>
         <w:t>CapabilitySampledCubeArray</w:t>
       </w:r>
       <w:proofErr w:type="spellEnd"/>
@@ -2434,43 +2383,43 @@
           <w:sz w:val="20"/>
           <w:szCs w:val="20"/>
         </w:rPr>
+        <w:t>CapabilityShaderClockKHR</w:t>
+      </w:r>
+      <w:proofErr w:type="spellEnd"/>
+    </w:p>
+    <w:p>
+      <w:pPr>
+        <w:pStyle w:val="ListParagraph"/>
+        <w:rPr>
+          <w:sz w:val="20"/>
+          <w:szCs w:val="20"/>
+        </w:rPr>
+      </w:pPr>
+      <w:proofErr w:type="spellStart"/>
+      <w:r>
+        <w:rPr>
+          <w:sz w:val="20"/>
+          <w:szCs w:val="20"/>
+        </w:rPr>
+        <w:t>CapabilityShaderViewportIndexLayerEXT</w:t>
+      </w:r>
+      <w:proofErr w:type="spellEnd"/>
+    </w:p>
+    <w:p>
+      <w:pPr>
+        <w:pStyle w:val="ListParagraph"/>
+        <w:rPr>
+          <w:sz w:val="20"/>
+          <w:szCs w:val="20"/>
+        </w:rPr>
+      </w:pPr>
+      <w:proofErr w:type="spellStart"/>
+      <w:r>
+        <w:rPr>
+          <w:sz w:val="20"/>
+          <w:szCs w:val="20"/>
+        </w:rPr>
         <w:lastRenderedPageBreak/>
-        <w:t>CapabilityShaderClockKHR</w:t>
-      </w:r>
-      <w:proofErr w:type="spellEnd"/>
-    </w:p>
-    <w:p>
-      <w:pPr>
-        <w:pStyle w:val="ListParagraph"/>
-        <w:rPr>
-          <w:sz w:val="20"/>
-          <w:szCs w:val="20"/>
-        </w:rPr>
-      </w:pPr>
-      <w:proofErr w:type="spellStart"/>
-      <w:r>
-        <w:rPr>
-          <w:sz w:val="20"/>
-          <w:szCs w:val="20"/>
-        </w:rPr>
-        <w:t>CapabilityShaderViewportIndexLayerEXT</w:t>
-      </w:r>
-      <w:proofErr w:type="spellEnd"/>
-    </w:p>
-    <w:p>
-      <w:pPr>
-        <w:pStyle w:val="ListParagraph"/>
-        <w:rPr>
-          <w:sz w:val="20"/>
-          <w:szCs w:val="20"/>
-        </w:rPr>
-      </w:pPr>
-      <w:proofErr w:type="spellStart"/>
-      <w:r>
-        <w:rPr>
-          <w:sz w:val="20"/>
-          <w:szCs w:val="20"/>
-        </w:rPr>
         <w:t>CapabilityFragmentShadingRateKHR</w:t>
       </w:r>
       <w:proofErr w:type="spellEnd"/>
@@ -3309,7 +3258,6 @@
           <w:sz w:val="20"/>
           <w:szCs w:val="20"/>
         </w:rPr>
-        <w:lastRenderedPageBreak/>
         <w:t>CapabilityFMAKHR</w:t>
       </w:r>
       <w:proofErr w:type="spellEnd"/>
@@ -3340,6 +3288,7 @@
           <w:sz w:val="20"/>
           <w:szCs w:val="20"/>
         </w:rPr>
+        <w:lastRenderedPageBreak/>
         <w:t>The Vulkan Offline</w:t>
       </w:r>
       <w:r>
@@ -3577,7 +3526,6 @@
           <w:szCs w:val="20"/>
         </w:rPr>
       </w:pPr>
-      <w:proofErr w:type="spellStart"/>
       <w:r>
         <w:rPr>
           <w:rFonts w:asciiTheme="minorHAnsi" w:eastAsiaTheme="minorHAnsi" w:hAnsiTheme="minorHAnsi" w:cstheme="minorBidi"/>
@@ -3587,7 +3535,6 @@
         </w:rPr>
         <w:t>SPV_KHR_shader_clock</w:t>
       </w:r>
-      <w:proofErr w:type="spellEnd"/>
     </w:p>
     <w:p>
       <w:pPr>

</xml_diff>